<commit_message>
fix: se arreglan errores de botones y de diseño para ver mejor la pagina
</commit_message>
<xml_diff>
--- a/docs/Entregables.docx
+++ b/docs/Entregables.docx
@@ -16530,6 +16530,233 @@
           <w:lang w:val="es-CO"/>
         </w:rPr>
         <w:t xml:space="preserve"> ajusta esto</w:t>
+      </w:r>
+    </w:p>
+    <w:p>
+      <w:pPr>
+        <w:rPr>
+          <w:lang w:val="es-CO"/>
+        </w:rPr>
+      </w:pPr>
+    </w:p>
+    <w:p>
+      <w:pPr>
+        <w:rPr>
+          <w:lang w:val="es-CO"/>
+        </w:rPr>
+      </w:pPr>
+      <w:r>
+        <w:rPr>
+          <w:lang w:val="es-CO"/>
+        </w:rPr>
+        <w:lastRenderedPageBreak/>
+        <w:t xml:space="preserve">genera el </w:t>
+      </w:r>
+      <w:proofErr w:type="spellStart"/>
+      <w:r>
+        <w:rPr>
+          <w:lang w:val="es-CO"/>
+        </w:rPr>
+        <w:t>byer</w:t>
+      </w:r>
+      <w:proofErr w:type="spellEnd"/>
+      <w:r>
+        <w:rPr>
+          <w:lang w:val="es-CO"/>
+        </w:rPr>
+        <w:t xml:space="preserve"> y </w:t>
+      </w:r>
+      <w:r>
+        <w:rPr>
+          <w:lang w:val="es-CO"/>
+        </w:rPr>
+        <w:t>colócalo</w:t>
+      </w:r>
+      <w:r>
+        <w:rPr>
+          <w:lang w:val="es-CO"/>
+        </w:rPr>
+        <w:t xml:space="preserve"> en el README.md y corrige todos los errores que se encontraron, </w:t>
+      </w:r>
+      <w:r>
+        <w:rPr>
+          <w:lang w:val="es-CO"/>
+        </w:rPr>
+        <w:t>además</w:t>
+      </w:r>
+      <w:r>
+        <w:rPr>
+          <w:lang w:val="es-CO"/>
+        </w:rPr>
+        <w:t xml:space="preserve"> quita el </w:t>
+      </w:r>
+      <w:r>
+        <w:rPr>
+          <w:lang w:val="es-CO"/>
+        </w:rPr>
+        <w:t>botón</w:t>
+      </w:r>
+      <w:r>
+        <w:rPr>
+          <w:lang w:val="es-CO"/>
+        </w:rPr>
+        <w:t xml:space="preserve"> de </w:t>
+      </w:r>
+      <w:r>
+        <w:rPr>
+          <w:lang w:val="es-CO"/>
+        </w:rPr>
+        <w:t>audio</w:t>
+      </w:r>
+      <w:r>
+        <w:rPr>
+          <w:lang w:val="es-CO"/>
+        </w:rPr>
+        <w:t xml:space="preserve"> off, arregla el </w:t>
+      </w:r>
+      <w:r>
+        <w:rPr>
+          <w:lang w:val="es-CO"/>
+        </w:rPr>
+        <w:t>botón</w:t>
+      </w:r>
+      <w:r>
+        <w:rPr>
+          <w:lang w:val="es-CO"/>
+        </w:rPr>
+        <w:t xml:space="preserve"> de reserva </w:t>
+      </w:r>
+      <w:r>
+        <w:rPr>
+          <w:lang w:val="es-CO"/>
+        </w:rPr>
+        <w:t>misión</w:t>
+      </w:r>
+      <w:r>
+        <w:rPr>
+          <w:lang w:val="es-CO"/>
+        </w:rPr>
+        <w:t xml:space="preserve">, al igual que en el </w:t>
+      </w:r>
+      <w:proofErr w:type="spellStart"/>
+      <w:r>
+        <w:rPr>
+          <w:lang w:val="es-CO"/>
+        </w:rPr>
+        <w:t>hero</w:t>
+      </w:r>
+      <w:proofErr w:type="spellEnd"/>
+      <w:r>
+        <w:rPr>
+          <w:lang w:val="es-CO"/>
+        </w:rPr>
+        <w:t xml:space="preserve"> arregla el </w:t>
+      </w:r>
+      <w:r>
+        <w:rPr>
+          <w:lang w:val="es-CO"/>
+        </w:rPr>
+        <w:t>botón</w:t>
+      </w:r>
+      <w:r>
+        <w:rPr>
+          <w:lang w:val="es-CO"/>
+        </w:rPr>
+        <w:t xml:space="preserve"> de iniciar despegue y explorar </w:t>
+      </w:r>
+      <w:r>
+        <w:rPr>
+          <w:lang w:val="es-CO"/>
+        </w:rPr>
+        <w:t>destinos</w:t>
+      </w:r>
+      <w:r>
+        <w:rPr>
+          <w:lang w:val="es-CO"/>
+        </w:rPr>
+        <w:t xml:space="preserve"> que se vean profesionales, recuerda no usar framworks ni anda solo estilos </w:t>
+      </w:r>
+      <w:proofErr w:type="spellStart"/>
+      <w:r>
+        <w:rPr>
+          <w:lang w:val="es-CO"/>
+        </w:rPr>
+        <w:t>css</w:t>
+      </w:r>
+      <w:proofErr w:type="spellEnd"/>
+      <w:r>
+        <w:rPr>
+          <w:lang w:val="es-CO"/>
+        </w:rPr>
+        <w:t xml:space="preserve">, </w:t>
+      </w:r>
+      <w:proofErr w:type="spellStart"/>
+      <w:r>
+        <w:rPr>
+          <w:lang w:val="es-CO"/>
+        </w:rPr>
+        <w:t>js</w:t>
+      </w:r>
+      <w:proofErr w:type="spellEnd"/>
+      <w:r>
+        <w:rPr>
+          <w:lang w:val="es-CO"/>
+        </w:rPr>
+        <w:t xml:space="preserve"> </w:t>
+      </w:r>
+      <w:proofErr w:type="spellStart"/>
+      <w:r>
+        <w:rPr>
+          <w:lang w:val="es-CO"/>
+        </w:rPr>
+        <w:t>vanila</w:t>
+      </w:r>
+      <w:proofErr w:type="spellEnd"/>
+      <w:r>
+        <w:rPr>
+          <w:lang w:val="es-CO"/>
+        </w:rPr>
+        <w:t xml:space="preserve"> y html5 </w:t>
+      </w:r>
+      <w:r>
+        <w:rPr>
+          <w:lang w:val="es-CO"/>
+        </w:rPr>
+        <w:t>semántico</w:t>
+      </w:r>
+      <w:r>
+        <w:rPr>
+          <w:lang w:val="es-CO"/>
+        </w:rPr>
+        <w:t xml:space="preserve"> y agrega un </w:t>
+      </w:r>
+      <w:proofErr w:type="spellStart"/>
+      <w:r>
+        <w:rPr>
+          <w:lang w:val="es-CO"/>
+        </w:rPr>
+        <w:t>footer</w:t>
+      </w:r>
+      <w:proofErr w:type="spellEnd"/>
+      <w:r>
+        <w:rPr>
+          <w:lang w:val="es-CO"/>
+        </w:rPr>
+        <w:t xml:space="preserve"> como si fuera una </w:t>
+      </w:r>
+      <w:proofErr w:type="spellStart"/>
+      <w:r>
+        <w:rPr>
+          <w:lang w:val="es-CO"/>
+        </w:rPr>
+        <w:t>landig</w:t>
+      </w:r>
+      <w:proofErr w:type="spellEnd"/>
+      <w:r>
+        <w:rPr>
+          <w:lang w:val="es-CO"/>
+        </w:rPr>
+        <w:t xml:space="preserve"> page comercial profesional</w:t>
       </w:r>
     </w:p>
     <w:sectPr>

</xml_diff>

<commit_message>
Fix & feat: se corrigen errores
</commit_message>
<xml_diff>
--- a/docs/Entregables.docx
+++ b/docs/Entregables.docx
@@ -15500,19 +15500,7 @@
         <w:rPr>
           <w:lang w:val="es-CO"/>
         </w:rPr>
-        <w:t xml:space="preserve"> de arreglos </w:t>
-      </w:r>
-      <w:r>
-        <w:rPr>
-          <w:lang w:val="es-CO"/>
-        </w:rPr>
-        <w:t>mínimos</w:t>
-      </w:r>
-      <w:r>
-        <w:rPr>
-          <w:lang w:val="es-CO"/>
-        </w:rPr>
-        <w:t xml:space="preserve"> sencillos</w:t>
+        <w:t xml:space="preserve"> de arreglos mínimos sencillos</w:t>
       </w:r>
     </w:p>
     <w:p>
@@ -16757,6 +16745,782 @@
           <w:lang w:val="es-CO"/>
         </w:rPr>
         <w:t xml:space="preserve"> page comercial profesional</w:t>
+      </w:r>
+    </w:p>
+    <w:p>
+      <w:pPr>
+        <w:rPr>
+          <w:lang w:val="es-CO"/>
+        </w:rPr>
+      </w:pPr>
+    </w:p>
+    <w:p>
+      <w:pPr>
+        <w:pStyle w:val="Titulo1APA"/>
+        <w:rPr>
+          <w:lang w:val="es-CO"/>
+        </w:rPr>
+      </w:pPr>
+      <w:r>
+        <w:rPr>
+          <w:lang w:val="es-CO"/>
+        </w:rPr>
+        <w:t xml:space="preserve">PROMPT PARA OPTIMIZAR PERFORMANCE </w:t>
+      </w:r>
+    </w:p>
+    <w:p>
+      <w:pPr>
+        <w:rPr>
+          <w:lang w:val="es-CO"/>
+        </w:rPr>
+      </w:pPr>
+    </w:p>
+    <w:p>
+      <w:pPr>
+        <w:rPr>
+          <w:lang w:val="es-CO"/>
+        </w:rPr>
+      </w:pPr>
+      <w:r>
+        <w:rPr>
+          <w:lang w:val="es-CO"/>
+        </w:rPr>
+        <w:t># [R] ROL</w:t>
+      </w:r>
+    </w:p>
+    <w:p>
+      <w:pPr>
+        <w:rPr>
+          <w:lang w:val="es-CO"/>
+        </w:rPr>
+      </w:pPr>
+      <w:r>
+        <w:rPr>
+          <w:lang w:val="es-CO"/>
+        </w:rPr>
+        <w:t>Actúa como un experto en optimización de rendimiento web (Web Performance Engineer) con amplia experiencia en mejorar puntajes de Google Lighthouse de 50 a 90+. Tu tono debe ser técnico, preciso y orientado a soluciones prácticas.</w:t>
+      </w:r>
+    </w:p>
+    <w:p>
+      <w:pPr>
+        <w:rPr>
+          <w:lang w:val="es-CO"/>
+        </w:rPr>
+      </w:pPr>
+    </w:p>
+    <w:p>
+      <w:pPr>
+        <w:rPr>
+          <w:lang w:val="es-CO"/>
+        </w:rPr>
+      </w:pPr>
+      <w:r>
+        <w:rPr>
+          <w:lang w:val="es-CO"/>
+        </w:rPr>
+        <w:t># [C] CONTEXTO</w:t>
+      </w:r>
+    </w:p>
+    <w:p>
+      <w:pPr>
+        <w:rPr>
+          <w:lang w:val="es-CO"/>
+        </w:rPr>
+      </w:pPr>
+      <w:r>
+        <w:rPr>
+          <w:lang w:val="es-CO"/>
+        </w:rPr>
+        <w:t xml:space="preserve">- El objetivo principal de este proyecto es: Mejorar el puntaje de Performance de Google Lighthouse de 59 a mínimo 90/100 en la </w:t>
+      </w:r>
+      <w:proofErr w:type="spellStart"/>
+      <w:r>
+        <w:rPr>
+          <w:lang w:val="es-CO"/>
+        </w:rPr>
+        <w:t>landing</w:t>
+      </w:r>
+      <w:proofErr w:type="spellEnd"/>
+      <w:r>
+        <w:rPr>
+          <w:lang w:val="es-CO"/>
+        </w:rPr>
+        <w:t xml:space="preserve"> page "Cosmos Tour" (agencia de turismo espacial).</w:t>
+      </w:r>
+    </w:p>
+    <w:p>
+      <w:pPr>
+        <w:rPr>
+          <w:lang w:val="es-CO"/>
+        </w:rPr>
+      </w:pPr>
+      <w:r>
+        <w:rPr>
+          <w:lang w:val="es-CO"/>
+        </w:rPr>
+        <w:t xml:space="preserve">- El público objetivo o audiencia es: Un profesor evaluador que exige mínimo 70/100 en cada categoría de Lighthouse. Actualmente tenemos 100 en </w:t>
+      </w:r>
+      <w:proofErr w:type="spellStart"/>
+      <w:r>
+        <w:rPr>
+          <w:lang w:val="es-CO"/>
+        </w:rPr>
+        <w:t>Accessibility</w:t>
+      </w:r>
+      <w:proofErr w:type="spellEnd"/>
+      <w:r>
+        <w:rPr>
+          <w:lang w:val="es-CO"/>
+        </w:rPr>
+        <w:t xml:space="preserve">, Best </w:t>
+      </w:r>
+      <w:proofErr w:type="spellStart"/>
+      <w:r>
+        <w:rPr>
+          <w:lang w:val="es-CO"/>
+        </w:rPr>
+        <w:t>Practices</w:t>
+      </w:r>
+      <w:proofErr w:type="spellEnd"/>
+      <w:r>
+        <w:rPr>
+          <w:lang w:val="es-CO"/>
+        </w:rPr>
+        <w:t xml:space="preserve"> y SEO, pero solo 59 en Performance.</w:t>
+      </w:r>
+    </w:p>
+    <w:p>
+      <w:pPr>
+        <w:rPr>
+          <w:lang w:val="es-CO"/>
+        </w:rPr>
+      </w:pPr>
+      <w:r>
+        <w:rPr>
+          <w:lang w:val="es-CO"/>
+        </w:rPr>
+        <w:t>- Los antecedentes o situación actual son: Se ejecutó Lighthouse y arrojó estas métricas críticas:</w:t>
+      </w:r>
+    </w:p>
+    <w:p>
+      <w:pPr>
+        <w:rPr>
+          <w:lang w:val="en-US"/>
+        </w:rPr>
+      </w:pPr>
+      <w:r>
+        <w:rPr>
+          <w:lang w:val="es-CO"/>
+        </w:rPr>
+        <w:t xml:space="preserve">  </w:t>
+      </w:r>
+      <w:r>
+        <w:rPr>
+          <w:lang w:val="en-US"/>
+        </w:rPr>
+        <w:t xml:space="preserve">* Performance: 59/100 </w:t>
+      </w:r>
+      <w:r>
+        <w:rPr>
+          <w:rFonts w:ascii="Segoe UI Emoji" w:hAnsi="Segoe UI Emoji" w:cs="Segoe UI Emoji"/>
+          <w:lang w:val="en-US"/>
+        </w:rPr>
+        <w:t>❌</w:t>
+      </w:r>
+      <w:r>
+        <w:rPr>
+          <w:lang w:val="en-US"/>
+        </w:rPr>
+        <w:t xml:space="preserve"> (</w:t>
+      </w:r>
+      <w:proofErr w:type="spellStart"/>
+      <w:r>
+        <w:rPr>
+          <w:lang w:val="en-US"/>
+        </w:rPr>
+        <w:t>objetivo</w:t>
+      </w:r>
+      <w:proofErr w:type="spellEnd"/>
+      <w:r>
+        <w:rPr>
+          <w:lang w:val="en-US"/>
+        </w:rPr>
+        <w:t>: 90+)</w:t>
+      </w:r>
+    </w:p>
+    <w:p>
+      <w:pPr>
+        <w:rPr>
+          <w:lang w:val="en-US"/>
+        </w:rPr>
+      </w:pPr>
+      <w:r>
+        <w:rPr>
+          <w:lang w:val="en-US"/>
+        </w:rPr>
+        <w:lastRenderedPageBreak/>
+        <w:t xml:space="preserve">  * First </w:t>
+      </w:r>
+      <w:proofErr w:type="spellStart"/>
+      <w:r>
+        <w:rPr>
+          <w:lang w:val="en-US"/>
+        </w:rPr>
+        <w:t>Contentful</w:t>
+      </w:r>
+      <w:proofErr w:type="spellEnd"/>
+      <w:r>
+        <w:rPr>
+          <w:lang w:val="en-US"/>
+        </w:rPr>
+        <w:t xml:space="preserve"> Paint (FCP): 2.3s  (</w:t>
+      </w:r>
+      <w:proofErr w:type="spellStart"/>
+      <w:r>
+        <w:rPr>
+          <w:lang w:val="en-US"/>
+        </w:rPr>
+        <w:t>debe</w:t>
+      </w:r>
+      <w:proofErr w:type="spellEnd"/>
+      <w:r>
+        <w:rPr>
+          <w:lang w:val="en-US"/>
+        </w:rPr>
+        <w:t xml:space="preserve"> ser &lt;1.8s)</w:t>
+      </w:r>
+    </w:p>
+    <w:p>
+      <w:pPr>
+        <w:rPr>
+          <w:lang w:val="en-US"/>
+        </w:rPr>
+      </w:pPr>
+      <w:r>
+        <w:rPr>
+          <w:lang w:val="en-US"/>
+        </w:rPr>
+        <w:t xml:space="preserve">  * Largest </w:t>
+      </w:r>
+      <w:proofErr w:type="spellStart"/>
+      <w:r>
+        <w:rPr>
+          <w:lang w:val="en-US"/>
+        </w:rPr>
+        <w:t>Contentful</w:t>
+      </w:r>
+      <w:proofErr w:type="spellEnd"/>
+      <w:r>
+        <w:rPr>
+          <w:lang w:val="en-US"/>
+        </w:rPr>
+        <w:t xml:space="preserve"> Paint (LCP): 8.1s CRÍTICO (</w:t>
+      </w:r>
+      <w:proofErr w:type="spellStart"/>
+      <w:r>
+        <w:rPr>
+          <w:lang w:val="en-US"/>
+        </w:rPr>
+        <w:t>debe</w:t>
+      </w:r>
+      <w:proofErr w:type="spellEnd"/>
+      <w:r>
+        <w:rPr>
+          <w:lang w:val="en-US"/>
+        </w:rPr>
+        <w:t xml:space="preserve"> ser &lt;2.5s)</w:t>
+      </w:r>
+    </w:p>
+    <w:p>
+      <w:pPr>
+        <w:rPr>
+          <w:lang w:val="en-US"/>
+        </w:rPr>
+      </w:pPr>
+      <w:r>
+        <w:rPr>
+          <w:lang w:val="en-US"/>
+        </w:rPr>
+        <w:t xml:space="preserve">  * Total Blocking Time (TBT): 20ms (</w:t>
+      </w:r>
+      <w:proofErr w:type="spellStart"/>
+      <w:r>
+        <w:rPr>
+          <w:lang w:val="en-US"/>
+        </w:rPr>
+        <w:t>excelente</w:t>
+      </w:r>
+      <w:proofErr w:type="spellEnd"/>
+      <w:r>
+        <w:rPr>
+          <w:lang w:val="en-US"/>
+        </w:rPr>
+        <w:t>)</w:t>
+      </w:r>
+    </w:p>
+    <w:p>
+      <w:pPr>
+        <w:rPr>
+          <w:lang w:val="es-CO"/>
+        </w:rPr>
+      </w:pPr>
+      <w:r>
+        <w:rPr>
+          <w:lang w:val="en-US"/>
+        </w:rPr>
+        <w:t xml:space="preserve">  </w:t>
+      </w:r>
+      <w:r>
+        <w:rPr>
+          <w:lang w:val="es-CO"/>
+        </w:rPr>
+        <w:t xml:space="preserve">* Cumulative </w:t>
+      </w:r>
+      <w:proofErr w:type="spellStart"/>
+      <w:r>
+        <w:rPr>
+          <w:lang w:val="es-CO"/>
+        </w:rPr>
+        <w:t>Layout</w:t>
+      </w:r>
+      <w:proofErr w:type="spellEnd"/>
+      <w:r>
+        <w:rPr>
+          <w:lang w:val="es-CO"/>
+        </w:rPr>
+        <w:t xml:space="preserve"> Shift (CLS): 0.276  (debe ser &lt;0.1)</w:t>
+      </w:r>
+    </w:p>
+    <w:p>
+      <w:pPr>
+        <w:rPr>
+          <w:lang w:val="es-CO"/>
+        </w:rPr>
+      </w:pPr>
+      <w:r>
+        <w:rPr>
+          <w:lang w:val="es-CO"/>
+        </w:rPr>
+        <w:t xml:space="preserve">  * Hay un aviso sobre </w:t>
+      </w:r>
+      <w:proofErr w:type="spellStart"/>
+      <w:r>
+        <w:rPr>
+          <w:lang w:val="es-CO"/>
+        </w:rPr>
+        <w:t>IndexedDB</w:t>
+      </w:r>
+      <w:proofErr w:type="spellEnd"/>
+      <w:r>
+        <w:rPr>
+          <w:lang w:val="es-CO"/>
+        </w:rPr>
+        <w:t xml:space="preserve"> almacenado afectando el rendimiento.</w:t>
+      </w:r>
+    </w:p>
+    <w:p>
+      <w:pPr>
+        <w:rPr>
+          <w:lang w:val="es-CO"/>
+        </w:rPr>
+      </w:pPr>
+      <w:r>
+        <w:rPr>
+          <w:lang w:val="es-CO"/>
+        </w:rPr>
+        <w:t>- Restricciones o limitaciones:</w:t>
+      </w:r>
+    </w:p>
+    <w:p>
+      <w:pPr>
+        <w:rPr>
+          <w:lang w:val="es-CO"/>
+        </w:rPr>
+      </w:pPr>
+      <w:r>
+        <w:rPr>
+          <w:lang w:val="es-CO"/>
+        </w:rPr>
+        <w:t xml:space="preserve">  * NO eliminar funcionalidades existentes (validación, </w:t>
+      </w:r>
+      <w:proofErr w:type="spellStart"/>
+      <w:r>
+        <w:rPr>
+          <w:lang w:val="es-CO"/>
+        </w:rPr>
+        <w:t>Intersection</w:t>
+      </w:r>
+      <w:proofErr w:type="spellEnd"/>
+      <w:r>
+        <w:rPr>
+          <w:lang w:val="es-CO"/>
+        </w:rPr>
+        <w:t xml:space="preserve"> </w:t>
+      </w:r>
+      <w:proofErr w:type="spellStart"/>
+      <w:r>
+        <w:rPr>
+          <w:lang w:val="es-CO"/>
+        </w:rPr>
+        <w:t>Observer</w:t>
+      </w:r>
+      <w:proofErr w:type="spellEnd"/>
+      <w:r>
+        <w:rPr>
+          <w:lang w:val="es-CO"/>
+        </w:rPr>
+        <w:t>, modo oscuro, etc.)</w:t>
+      </w:r>
+    </w:p>
+    <w:p>
+      <w:pPr>
+        <w:rPr>
+          <w:lang w:val="es-CO"/>
+        </w:rPr>
+      </w:pPr>
+      <w:r>
+        <w:rPr>
+          <w:lang w:val="es-CO"/>
+        </w:rPr>
+        <w:t xml:space="preserve">  * NO cambiar la estética visual ni la paleta de colores</w:t>
+      </w:r>
+    </w:p>
+    <w:p>
+      <w:pPr>
+        <w:rPr>
+          <w:lang w:val="es-CO"/>
+        </w:rPr>
+      </w:pPr>
+      <w:r>
+        <w:rPr>
+          <w:lang w:val="es-CO"/>
+        </w:rPr>
+        <w:t xml:space="preserve">  * Mantener todas las secciones obligatorias</w:t>
+      </w:r>
+    </w:p>
+    <w:p>
+      <w:pPr>
+        <w:rPr>
+          <w:lang w:val="es-CO"/>
+        </w:rPr>
+      </w:pPr>
+      <w:r>
+        <w:rPr>
+          <w:lang w:val="es-CO"/>
+        </w:rPr>
+        <w:t xml:space="preserve">  * El archivo script.js puede optimizarse pero no eliminarse</w:t>
+      </w:r>
+    </w:p>
+    <w:p>
+      <w:pPr>
+        <w:rPr>
+          <w:lang w:val="es-CO"/>
+        </w:rPr>
+      </w:pPr>
+      <w:r>
+        <w:rPr>
+          <w:lang w:val="es-CO"/>
+        </w:rPr>
+        <w:t xml:space="preserve">  * Las imágenes y </w:t>
+      </w:r>
+      <w:proofErr w:type="spellStart"/>
+      <w:r>
+        <w:rPr>
+          <w:lang w:val="es-CO"/>
+        </w:rPr>
+        <w:t>assets</w:t>
+      </w:r>
+      <w:proofErr w:type="spellEnd"/>
+      <w:r>
+        <w:rPr>
+          <w:lang w:val="es-CO"/>
+        </w:rPr>
+        <w:t xml:space="preserve"> deben conservarse</w:t>
+      </w:r>
+    </w:p>
+    <w:p>
+      <w:pPr>
+        <w:rPr>
+          <w:lang w:val="es-CO"/>
+        </w:rPr>
+      </w:pPr>
+    </w:p>
+    <w:p>
+      <w:pPr>
+        <w:rPr>
+          <w:lang w:val="es-CO"/>
+        </w:rPr>
+      </w:pPr>
+      <w:r>
+        <w:rPr>
+          <w:lang w:val="es-CO"/>
+        </w:rPr>
+        <w:t># [I] INSTRUCCIÓN</w:t>
+      </w:r>
+    </w:p>
+    <w:p>
+      <w:pPr>
+        <w:rPr>
+          <w:lang w:val="es-CO"/>
+        </w:rPr>
+      </w:pPr>
+      <w:r>
+        <w:rPr>
+          <w:lang w:val="es-CO"/>
+        </w:rPr>
+        <w:t>Necesito que realices las siguientes optimizaciones paso a paso para mejorar el Performance de Lighthouse:</w:t>
+      </w:r>
+    </w:p>
+    <w:p>
+      <w:pPr>
+        <w:rPr>
+          <w:lang w:val="es-CO"/>
+        </w:rPr>
+      </w:pPr>
+    </w:p>
+    <w:p>
+      <w:pPr>
+        <w:rPr>
+          <w:lang w:val="es-CO"/>
+        </w:rPr>
+      </w:pPr>
+      <w:r>
+        <w:rPr>
+          <w:lang w:val="es-CO"/>
+        </w:rPr>
+        <w:t>## OPTIMIZACIÓN 1: REDUCIR LARGEST CONTENTFUL PAINT (LCP) de 8.1s a &lt;2.5s</w:t>
+      </w:r>
+    </w:p>
+    <w:p>
+      <w:pPr>
+        <w:rPr>
+          <w:lang w:val="es-CO"/>
+        </w:rPr>
+      </w:pPr>
+    </w:p>
+    <w:p>
+      <w:pPr>
+        <w:rPr>
+          <w:lang w:val="es-CO"/>
+        </w:rPr>
+      </w:pPr>
+      <w:r>
+        <w:rPr>
+          <w:lang w:val="es-CO"/>
+        </w:rPr>
+        <w:t>El LCP de 8.1s indica que el elemento más grande de la página tarda mucho en cargar. Identifica y optimiza:</w:t>
+      </w:r>
+    </w:p>
+    <w:p>
+      <w:pPr>
+        <w:rPr>
+          <w:lang w:val="es-CO"/>
+        </w:rPr>
+      </w:pPr>
+    </w:p>
+    <w:p>
+      <w:pPr>
+        <w:rPr>
+          <w:lang w:val="es-CO"/>
+        </w:rPr>
+      </w:pPr>
+      <w:r>
+        <w:rPr>
+          <w:lang w:val="es-CO"/>
+        </w:rPr>
+        <w:lastRenderedPageBreak/>
+        <w:t xml:space="preserve">### 1.1 </w:t>
+      </w:r>
+      <w:proofErr w:type="spellStart"/>
+      <w:r>
+        <w:rPr>
+          <w:lang w:val="es-CO"/>
+        </w:rPr>
+        <w:t>Preload</w:t>
+      </w:r>
+      <w:proofErr w:type="spellEnd"/>
+      <w:r>
+        <w:rPr>
+          <w:lang w:val="es-CO"/>
+        </w:rPr>
+        <w:t xml:space="preserve"> de recursos críticos</w:t>
+      </w:r>
+    </w:p>
+    <w:p>
+      <w:pPr>
+        <w:rPr>
+          <w:lang w:val="es-CO"/>
+        </w:rPr>
+      </w:pPr>
+      <w:r>
+        <w:rPr>
+          <w:lang w:val="es-CO"/>
+        </w:rPr>
+        <w:t>Agregar en el &lt;head&gt; del HTML:</w:t>
+      </w:r>
+    </w:p>
+    <w:p>
+      <w:pPr>
+        <w:rPr>
+          <w:lang w:val="en-US"/>
+        </w:rPr>
+      </w:pPr>
+      <w:r>
+        <w:rPr>
+          <w:lang w:val="en-US"/>
+        </w:rPr>
+        <w:t>```html</w:t>
+      </w:r>
+    </w:p>
+    <w:p>
+      <w:pPr>
+        <w:rPr>
+          <w:lang w:val="en-US"/>
+        </w:rPr>
+      </w:pPr>
+      <w:r>
+        <w:rPr>
+          <w:lang w:val="en-US"/>
+        </w:rPr>
+        <w:t xml:space="preserve">&lt;link </w:t>
+      </w:r>
+      <w:proofErr w:type="spellStart"/>
+      <w:r>
+        <w:rPr>
+          <w:lang w:val="en-US"/>
+        </w:rPr>
+        <w:t>rel</w:t>
+      </w:r>
+      <w:proofErr w:type="spellEnd"/>
+      <w:r>
+        <w:rPr>
+          <w:lang w:val="en-US"/>
+        </w:rPr>
+        <w:t xml:space="preserve">="preload" </w:t>
+      </w:r>
+      <w:proofErr w:type="spellStart"/>
+      <w:r>
+        <w:rPr>
+          <w:lang w:val="en-US"/>
+        </w:rPr>
+        <w:t>href</w:t>
+      </w:r>
+      <w:proofErr w:type="spellEnd"/>
+      <w:r>
+        <w:rPr>
+          <w:lang w:val="en-US"/>
+        </w:rPr>
+        <w:t>="styles.css" as="style"&gt;</w:t>
+      </w:r>
+    </w:p>
+    <w:p>
+      <w:pPr>
+        <w:rPr>
+          <w:lang w:val="en-US"/>
+        </w:rPr>
+      </w:pPr>
+      <w:r>
+        <w:rPr>
+          <w:lang w:val="en-US"/>
+        </w:rPr>
+        <w:t xml:space="preserve">&lt;link </w:t>
+      </w:r>
+      <w:proofErr w:type="spellStart"/>
+      <w:r>
+        <w:rPr>
+          <w:lang w:val="en-US"/>
+        </w:rPr>
+        <w:t>rel</w:t>
+      </w:r>
+      <w:proofErr w:type="spellEnd"/>
+      <w:r>
+        <w:rPr>
+          <w:lang w:val="en-US"/>
+        </w:rPr>
+        <w:t xml:space="preserve">="preload" </w:t>
+      </w:r>
+      <w:proofErr w:type="spellStart"/>
+      <w:r>
+        <w:rPr>
+          <w:lang w:val="en-US"/>
+        </w:rPr>
+        <w:t>href</w:t>
+      </w:r>
+      <w:proofErr w:type="spellEnd"/>
+      <w:r>
+        <w:rPr>
+          <w:lang w:val="en-US"/>
+        </w:rPr>
+        <w:t>="script.js" as="script"&gt;</w:t>
+      </w:r>
+    </w:p>
+    <w:p>
+      <w:pPr>
+        <w:rPr>
+          <w:lang w:val="en-US"/>
+        </w:rPr>
+      </w:pPr>
+      <w:r>
+        <w:rPr>
+          <w:lang w:val="en-US"/>
+        </w:rPr>
+        <w:t xml:space="preserve">&lt;link </w:t>
+      </w:r>
+      <w:proofErr w:type="spellStart"/>
+      <w:r>
+        <w:rPr>
+          <w:lang w:val="en-US"/>
+        </w:rPr>
+        <w:t>rel</w:t>
+      </w:r>
+      <w:proofErr w:type="spellEnd"/>
+      <w:r>
+        <w:rPr>
+          <w:lang w:val="en-US"/>
+        </w:rPr>
+        <w:t xml:space="preserve">="preload" </w:t>
+      </w:r>
+      <w:proofErr w:type="spellStart"/>
+      <w:r>
+        <w:rPr>
+          <w:lang w:val="en-US"/>
+        </w:rPr>
+        <w:t>href</w:t>
+      </w:r>
+      <w:proofErr w:type="spellEnd"/>
+      <w:r>
+        <w:rPr>
+          <w:lang w:val="en-US"/>
+        </w:rPr>
+        <w:t>="https://fonts.googleapis.com/css2?family=</w:t>
+      </w:r>
+      <w:proofErr w:type="spellStart"/>
+      <w:r>
+        <w:rPr>
+          <w:lang w:val="en-US"/>
+        </w:rPr>
+        <w:t>Space+Grotesk</w:t>
+      </w:r>
+      <w:proofErr w:type="spellEnd"/>
+      <w:r>
+        <w:rPr>
+          <w:lang w:val="en-US"/>
+        </w:rPr>
+        <w:t xml:space="preserve">..." as="style" </w:t>
+      </w:r>
+      <w:proofErr w:type="spellStart"/>
+      <w:r>
+        <w:rPr>
+          <w:lang w:val="en-US"/>
+        </w:rPr>
+        <w:t>crossorigin</w:t>
+      </w:r>
+      <w:proofErr w:type="spellEnd"/>
+      <w:r>
+        <w:rPr>
+          <w:lang w:val="en-US"/>
+        </w:rPr>
+        <w:t>&gt;</w:t>
       </w:r>
     </w:p>
     <w:sectPr>

</xml_diff>